<commit_message>
Redesign UI: editorial warm palette, paginated repositories, animations
Reworks the dashboard around a warm editorial palette (cream, coral, tan, stone)
with Space Grotesk/Inter type, count-up KPIs, a sliding tab indicator, staggered
reveals and anime.js chart motion. Repositories are now ranked and paginated
(8/page) with a numbered pager instead of one long list. Updated explanation doc
and screenshots.

Co-Authored-By: Claude Opus 5.5 <noreply@anthropic.com>
</commit_message>
<xml_diff>
--- a/GitHub_Insights_Dashboard_Explanation.docx
+++ b/GitHub_Insights_Dashboard_Explanation.docx
@@ -402,7 +402,7 @@
           </w:pPr>
           <w:hyperlink w:history="1" w:anchor="_Toc13">
             <w:r>
-              <w:t xml:space="preserve">6.2  Saving an insight</w:t>
+              <w:t xml:space="preserve">6.2  Charts</w:t>
             </w:r>
             <w:r>
               <w:tab/>
@@ -425,7 +425,7 @@
           </w:pPr>
           <w:hyperlink w:history="1" w:anchor="_Toc14">
             <w:r>
-              <w:t xml:space="preserve">6.3  Saved-insights view</w:t>
+              <w:t xml:space="preserve">6.3  Paginated repositories</w:t>
             </w:r>
             <w:r>
               <w:tab/>
@@ -448,7 +448,7 @@
           </w:pPr>
           <w:hyperlink w:history="1" w:anchor="_Toc15">
             <w:r>
-              <w:t xml:space="preserve">6.4  Filtering saved insights</w:t>
+              <w:t xml:space="preserve">6.4  Saving an insight</w:t>
             </w:r>
             <w:r>
               <w:tab/>
@@ -471,7 +471,7 @@
           </w:pPr>
           <w:hyperlink w:history="1" w:anchor="_Toc16">
             <w:r>
-              <w:t xml:space="preserve">6.5  Graceful error state</w:t>
+              <w:t xml:space="preserve">6.5  Saved-insights view</w:t>
             </w:r>
             <w:r>
               <w:tab/>
@@ -486,14 +486,15 @@
         </w:p>
         <w:p>
           <w:pPr>
-            <w:pStyle w:val="TOC1"/>
+            <w:pStyle w:val="TOC2"/>
             <w:tabs>
               <w:tab w:val="right" w:pos="9840" w:leader="dot"/>
             </w:tabs>
+            <w:ind w:left="220"/>
           </w:pPr>
           <w:hyperlink w:history="1" w:anchor="_Toc17">
             <w:r>
-              <w:t xml:space="preserve">7.  Design Decisions</w:t>
+              <w:t xml:space="preserve">6.6  Graceful error state</w:t>
             </w:r>
             <w:r>
               <w:tab/>
@@ -515,7 +516,7 @@
           </w:pPr>
           <w:hyperlink w:history="1" w:anchor="_Toc18">
             <w:r>
-              <w:t xml:space="preserve">8.  Assumptions</w:t>
+              <w:t xml:space="preserve">7.  Design Decisions</w:t>
             </w:r>
             <w:r>
               <w:tab/>
@@ -537,7 +538,7 @@
           </w:pPr>
           <w:hyperlink w:history="1" w:anchor="_Toc19">
             <w:r>
-              <w:t xml:space="preserve">9.  Known Limitations</w:t>
+              <w:t xml:space="preserve">8.  Assumptions</w:t>
             </w:r>
             <w:r>
               <w:tab/>
@@ -559,7 +560,7 @@
           </w:pPr>
           <w:hyperlink w:history="1" w:anchor="_Toc20">
             <w:r>
-              <w:t xml:space="preserve">10.  What I Would Improve Next</w:t>
+              <w:t xml:space="preserve">9.  Known Limitations</w:t>
             </w:r>
             <w:r>
               <w:tab/>
@@ -567,6 +568,28 @@
             <w:r>
               <w:fldChar w:fldCharType="begin" w:dirty="true"/>
               <w:instrText xml:space="preserve">PAGEREF _Toc20 \h</w:instrText>
+              <w:fldChar w:fldCharType="separate"/>
+              <w:fldChar w:fldCharType="end"/>
+            </w:r>
+          </w:hyperlink>
+        </w:p>
+        <w:p>
+          <w:pPr>
+            <w:pStyle w:val="TOC1"/>
+            <w:tabs>
+              <w:tab w:val="right" w:pos="9840" w:leader="dot"/>
+            </w:tabs>
+          </w:pPr>
+          <w:hyperlink w:history="1" w:anchor="_Toc21">
+            <w:r>
+              <w:t xml:space="preserve">10.  What I Would Improve Next</w:t>
+            </w:r>
+            <w:r>
+              <w:tab/>
+            </w:r>
+            <w:r>
+              <w:fldChar w:fldCharType="begin" w:dirty="true"/>
+              <w:instrText xml:space="preserve">PAGEREF _Toc21 \h</w:instrText>
               <w:fldChar w:fldCharType="separate"/>
               <w:fldChar w:fldCharType="end"/>
             </w:r>
@@ -818,6 +841,62 @@
           <w:szCs w:val="22"/>
         </w:rPr>
         <w:t xml:space="preserve">saved insights by priority, free text, and sort order.</w:t>
+      </w:r>
+    </w:p>
+    <w:p>
+      <w:pPr>
+        <w:pStyle w:val="ListParagraph"/>
+        <w:numPr>
+          <w:ilvl w:val="0"/>
+          <w:numId w:val="2"/>
+        </w:numPr>
+        <w:spacing w:after="60" w:line="276"/>
+      </w:pPr>
+      <w:r>
+        <w:rPr>
+          <w:b/>
+          <w:bCs/>
+          <w:color w:val="1F2430"/>
+          <w:sz w:val="22"/>
+          <w:szCs w:val="22"/>
+        </w:rPr>
+        <w:t xml:space="preserve">Paginated repository list:  </w:t>
+      </w:r>
+      <w:r>
+        <w:rPr>
+          <w:color w:val="1F2430"/>
+          <w:sz w:val="22"/>
+          <w:szCs w:val="22"/>
+        </w:rPr>
+        <w:t xml:space="preserve">repositories are ranked and shown eight per page with a numbered pager — never one overwhelming dump.</w:t>
+      </w:r>
+    </w:p>
+    <w:p>
+      <w:pPr>
+        <w:pStyle w:val="ListParagraph"/>
+        <w:numPr>
+          <w:ilvl w:val="0"/>
+          <w:numId w:val="2"/>
+        </w:numPr>
+        <w:spacing w:after="60" w:line="276"/>
+      </w:pPr>
+      <w:r>
+        <w:rPr>
+          <w:b/>
+          <w:bCs/>
+          <w:color w:val="1F2430"/>
+          <w:sz w:val="22"/>
+          <w:szCs w:val="22"/>
+        </w:rPr>
+        <w:t xml:space="preserve">Refined editorial UI:  </w:t>
+      </w:r>
+      <w:r>
+        <w:rPr>
+          <w:color w:val="1F2430"/>
+          <w:sz w:val="22"/>
+          <w:szCs w:val="22"/>
+        </w:rPr>
+        <w:t xml:space="preserve">a warm, minimal design (cream canvas, coral accents, generous spaced type) with count-up KPI numbers, a sliding tab indicator, staggered reveals, and animated charts, built with CSS and anime.js.</w:t>
       </w:r>
     </w:p>
     <w:p>
@@ -1431,6 +1510,178 @@
                 <w:sz w:val="19"/>
                 <w:szCs w:val="19"/>
               </w:rPr>
+              <w:t xml:space="preserve">Animation</w:t>
+            </w:r>
+          </w:p>
+        </w:tc>
+        <w:tc>
+          <w:tcPr>
+            <w:tcW w:type="dxa" w:w="2900"/>
+            <w:tcBorders>
+              <w:top w:val="single" w:color="D6D9E0" w:sz="4"/>
+              <w:left w:val="single" w:color="D6D9E0" w:sz="4"/>
+              <w:bottom w:val="single" w:color="D6D9E0" w:sz="4"/>
+              <w:right w:val="single" w:color="D6D9E0" w:sz="4"/>
+            </w:tcBorders>
+            <w:shd w:fill="F6F7FA" w:val="clear"/>
+            <w:tcMar>
+              <w:top w:type="dxa" w:w="50"/>
+              <w:left w:type="dxa" w:w="100"/>
+              <w:bottom w:type="dxa" w:w="50"/>
+              <w:right w:type="dxa" w:w="100"/>
+            </w:tcMar>
+          </w:tcPr>
+          <w:p>
+            <w:r>
+              <w:rPr>
+                <w:color w:val="1F2430"/>
+                <w:sz w:val="19"/>
+                <w:szCs w:val="19"/>
+              </w:rPr>
+              <w:t xml:space="preserve">anime.js + CSS</w:t>
+            </w:r>
+          </w:p>
+        </w:tc>
+        <w:tc>
+          <w:tcPr>
+            <w:tcW w:type="dxa" w:w="4200"/>
+            <w:tcBorders>
+              <w:top w:val="single" w:color="D6D9E0" w:sz="4"/>
+              <w:left w:val="single" w:color="D6D9E0" w:sz="4"/>
+              <w:bottom w:val="single" w:color="D6D9E0" w:sz="4"/>
+              <w:right w:val="single" w:color="D6D9E0" w:sz="4"/>
+            </w:tcBorders>
+            <w:shd w:fill="F6F7FA" w:val="clear"/>
+            <w:tcMar>
+              <w:top w:type="dxa" w:w="50"/>
+              <w:left w:type="dxa" w:w="100"/>
+              <w:bottom w:type="dxa" w:w="50"/>
+              <w:right w:type="dxa" w:w="100"/>
+            </w:tcMar>
+          </w:tcPr>
+          <w:p>
+            <w:r>
+              <w:rPr>
+                <w:color w:val="1F2430"/>
+                <w:sz w:val="19"/>
+                <w:szCs w:val="19"/>
+              </w:rPr>
+              <w:t xml:space="preserve">Count-ups, staggered reveals, aurora background</w:t>
+            </w:r>
+          </w:p>
+        </w:tc>
+      </w:tr>
+      <w:tr>
+        <w:tc>
+          <w:tcPr>
+            <w:tcW w:type="dxa" w:w="1900"/>
+            <w:tcBorders>
+              <w:top w:val="single" w:color="D6D9E0" w:sz="4"/>
+              <w:left w:val="single" w:color="D6D9E0" w:sz="4"/>
+              <w:bottom w:val="single" w:color="D6D9E0" w:sz="4"/>
+              <w:right w:val="single" w:color="D6D9E0" w:sz="4"/>
+            </w:tcBorders>
+            <w:shd w:fill="FFFFFF" w:val="clear"/>
+            <w:tcMar>
+              <w:top w:type="dxa" w:w="50"/>
+              <w:left w:type="dxa" w:w="100"/>
+              <w:bottom w:type="dxa" w:w="50"/>
+              <w:right w:type="dxa" w:w="100"/>
+            </w:tcMar>
+          </w:tcPr>
+          <w:p>
+            <w:r>
+              <w:rPr>
+                <w:color w:val="1F2430"/>
+                <w:sz w:val="19"/>
+                <w:szCs w:val="19"/>
+              </w:rPr>
+              <w:t xml:space="preserve">Fonts</w:t>
+            </w:r>
+          </w:p>
+        </w:tc>
+        <w:tc>
+          <w:tcPr>
+            <w:tcW w:type="dxa" w:w="2900"/>
+            <w:tcBorders>
+              <w:top w:val="single" w:color="D6D9E0" w:sz="4"/>
+              <w:left w:val="single" w:color="D6D9E0" w:sz="4"/>
+              <w:bottom w:val="single" w:color="D6D9E0" w:sz="4"/>
+              <w:right w:val="single" w:color="D6D9E0" w:sz="4"/>
+            </w:tcBorders>
+            <w:shd w:fill="FFFFFF" w:val="clear"/>
+            <w:tcMar>
+              <w:top w:type="dxa" w:w="50"/>
+              <w:left w:type="dxa" w:w="100"/>
+              <w:bottom w:type="dxa" w:w="50"/>
+              <w:right w:type="dxa" w:w="100"/>
+            </w:tcMar>
+          </w:tcPr>
+          <w:p>
+            <w:r>
+              <w:rPr>
+                <w:color w:val="1F2430"/>
+                <w:sz w:val="19"/>
+                <w:szCs w:val="19"/>
+              </w:rPr>
+              <w:t xml:space="preserve">Space Grotesk + Inter</w:t>
+            </w:r>
+          </w:p>
+        </w:tc>
+        <w:tc>
+          <w:tcPr>
+            <w:tcW w:type="dxa" w:w="4200"/>
+            <w:tcBorders>
+              <w:top w:val="single" w:color="D6D9E0" w:sz="4"/>
+              <w:left w:val="single" w:color="D6D9E0" w:sz="4"/>
+              <w:bottom w:val="single" w:color="D6D9E0" w:sz="4"/>
+              <w:right w:val="single" w:color="D6D9E0" w:sz="4"/>
+            </w:tcBorders>
+            <w:shd w:fill="FFFFFF" w:val="clear"/>
+            <w:tcMar>
+              <w:top w:type="dxa" w:w="50"/>
+              <w:left w:type="dxa" w:w="100"/>
+              <w:bottom w:type="dxa" w:w="50"/>
+              <w:right w:type="dxa" w:w="100"/>
+            </w:tcMar>
+          </w:tcPr>
+          <w:p>
+            <w:r>
+              <w:rPr>
+                <w:color w:val="1F2430"/>
+                <w:sz w:val="19"/>
+                <w:szCs w:val="19"/>
+              </w:rPr>
+              <w:t xml:space="preserve">Modern display + readable body type</w:t>
+            </w:r>
+          </w:p>
+        </w:tc>
+      </w:tr>
+      <w:tr>
+        <w:tc>
+          <w:tcPr>
+            <w:tcW w:type="dxa" w:w="1900"/>
+            <w:tcBorders>
+              <w:top w:val="single" w:color="D6D9E0" w:sz="4"/>
+              <w:left w:val="single" w:color="D6D9E0" w:sz="4"/>
+              <w:bottom w:val="single" w:color="D6D9E0" w:sz="4"/>
+              <w:right w:val="single" w:color="D6D9E0" w:sz="4"/>
+            </w:tcBorders>
+            <w:shd w:fill="F6F7FA" w:val="clear"/>
+            <w:tcMar>
+              <w:top w:type="dxa" w:w="50"/>
+              <w:left w:type="dxa" w:w="100"/>
+              <w:bottom w:type="dxa" w:w="50"/>
+              <w:right w:type="dxa" w:w="100"/>
+            </w:tcMar>
+          </w:tcPr>
+          <w:p>
+            <w:r>
+              <w:rPr>
+                <w:color w:val="1F2430"/>
+                <w:sz w:val="19"/>
+                <w:szCs w:val="19"/>
+              </w:rPr>
               <w:t xml:space="preserve">Tests</w:t>
             </w:r>
           </w:p>
@@ -2773,7 +3024,7 @@
       <w:r>
         <w:drawing>
           <wp:inline distT="0" distB="0" distL="0" distR="0">
-            <wp:extent cx="4191000" cy="5581650"/>
+            <wp:extent cx="3619500" cy="4410075"/>
             <wp:effectExtent t="0" r="0" b="0" l="0"/>
             <wp:docPr id="1" name="" descr="" title=""/>
             <wp:cNvGraphicFramePr>
@@ -2798,7 +3049,7 @@
                   <pic:spPr bwMode="auto">
                     <a:xfrm>
                       <a:off x="0" y="0"/>
-                      <a:ext cx="4191000" cy="5581650"/>
+                      <a:ext cx="3619500" cy="4410075"/>
                     </a:xfrm>
                     <a:prstGeom prst="rect">
                       <a:avLst/>
@@ -2824,7 +3075,7 @@
           <w:sz w:val="18"/>
           <w:szCs w:val="18"/>
         </w:rPr>
-        <w:t xml:space="preserve">Live metrics, a derived-insight banner, two charts, and a filterable repository table.</w:t>
+        <w:t xml:space="preserve">Count-up KPI tiles and a derived-insight banner on a warm, editorial canvas.</w:t>
       </w:r>
     </w:p>
     <w:p>
@@ -2839,7 +3090,7 @@
           <w:bCs/>
           <w:color w:val="16324F"/>
         </w:rPr>
-        <w:t xml:space="preserve">6.2  Saving an insight</w:t>
+        <w:t xml:space="preserve">6.2  Charts</w:t>
       </w:r>
       <w:bookmarkEnd w:id="13"/>
     </w:p>
@@ -2851,7 +3102,7 @@
       <w:r>
         <w:drawing>
           <wp:inline distT="0" distB="0" distL="0" distR="0">
-            <wp:extent cx="5715000" cy="4286250"/>
+            <wp:extent cx="3619500" cy="4410075"/>
             <wp:effectExtent t="0" r="0" b="0" l="0"/>
             <wp:docPr id="2" name="" descr="" title=""/>
             <wp:cNvGraphicFramePr>
@@ -2876,7 +3127,7 @@
                   <pic:spPr bwMode="auto">
                     <a:xfrm>
                       <a:off x="0" y="0"/>
-                      <a:ext cx="5715000" cy="4286250"/>
+                      <a:ext cx="3619500" cy="4410075"/>
                     </a:xfrm>
                     <a:prstGeom prst="rect">
                       <a:avLst/>
@@ -2902,7 +3153,7 @@
           <w:sz w:val="18"/>
           <w:szCs w:val="18"/>
         </w:rPr>
-        <w:t xml:space="preserve">A note and a priority are attached to a repository and written to SQLite.</w:t>
+        <w:t xml:space="preserve">Top repositories by stars and an animated language-distribution doughnut, in the brand palette.</w:t>
       </w:r>
     </w:p>
     <w:p>
@@ -2917,7 +3168,7 @@
           <w:bCs/>
           <w:color w:val="16324F"/>
         </w:rPr>
-        <w:t xml:space="preserve">6.3  Saved-insights view</w:t>
+        <w:t xml:space="preserve">6.3  Paginated repositories</w:t>
       </w:r>
       <w:bookmarkEnd w:id="14"/>
     </w:p>
@@ -2929,7 +3180,7 @@
       <w:r>
         <w:drawing>
           <wp:inline distT="0" distB="0" distL="0" distR="0">
-            <wp:extent cx="5715000" cy="4286250"/>
+            <wp:extent cx="3619500" cy="4410075"/>
             <wp:effectExtent t="0" r="0" b="0" l="0"/>
             <wp:docPr id="3" name="" descr="" title=""/>
             <wp:cNvGraphicFramePr>
@@ -2954,7 +3205,7 @@
                   <pic:spPr bwMode="auto">
                     <a:xfrm>
                       <a:off x="0" y="0"/>
-                      <a:ext cx="5715000" cy="4286250"/>
+                      <a:ext cx="3619500" cy="4410075"/>
                     </a:xfrm>
                     <a:prstGeom prst="rect">
                       <a:avLst/>
@@ -2980,7 +3231,7 @@
           <w:sz w:val="18"/>
           <w:szCs w:val="18"/>
         </w:rPr>
-        <w:t xml:space="preserve">Item name, note, colour-coded priority, and timestamp, each with Edit and Delete.</w:t>
+        <w:t xml:space="preserve">A ranked, numbered repository table — eight per page with a numbered pager, not one long dump.</w:t>
       </w:r>
     </w:p>
     <w:p>
@@ -2995,7 +3246,7 @@
           <w:bCs/>
           <w:color w:val="16324F"/>
         </w:rPr>
-        <w:t xml:space="preserve">6.4  Filtering saved insights</w:t>
+        <w:t xml:space="preserve">6.4  Saving an insight</w:t>
       </w:r>
       <w:bookmarkEnd w:id="15"/>
     </w:p>
@@ -3007,7 +3258,7 @@
       <w:r>
         <w:drawing>
           <wp:inline distT="0" distB="0" distL="0" distR="0">
-            <wp:extent cx="5715000" cy="4286250"/>
+            <wp:extent cx="3619500" cy="4410075"/>
             <wp:effectExtent t="0" r="0" b="0" l="0"/>
             <wp:docPr id="4" name="" descr="" title=""/>
             <wp:cNvGraphicFramePr>
@@ -3032,7 +3283,7 @@
                   <pic:spPr bwMode="auto">
                     <a:xfrm>
                       <a:off x="0" y="0"/>
-                      <a:ext cx="5715000" cy="4286250"/>
+                      <a:ext cx="3619500" cy="4410075"/>
                     </a:xfrm>
                     <a:prstGeom prst="rect">
                       <a:avLst/>
@@ -3058,7 +3309,7 @@
           <w:sz w:val="18"/>
           <w:szCs w:val="18"/>
         </w:rPr>
-        <w:t xml:space="preserve">Filtering the saved list to High-priority items only.</w:t>
+        <w:t xml:space="preserve">A note and a priority (segmented picker) attached to a repository and written to SQLite.</w:t>
       </w:r>
     </w:p>
     <w:p>
@@ -3073,7 +3324,7 @@
           <w:bCs/>
           <w:color w:val="16324F"/>
         </w:rPr>
-        <w:t xml:space="preserve">6.5  Graceful error state</w:t>
+        <w:t xml:space="preserve">6.5  Saved-insights view</w:t>
       </w:r>
       <w:bookmarkEnd w:id="16"/>
     </w:p>
@@ -3085,7 +3336,7 @@
       <w:r>
         <w:drawing>
           <wp:inline distT="0" distB="0" distL="0" distR="0">
-            <wp:extent cx="5715000" cy="4286250"/>
+            <wp:extent cx="3619500" cy="4410075"/>
             <wp:effectExtent t="0" r="0" b="0" l="0"/>
             <wp:docPr id="5" name="" descr="" title=""/>
             <wp:cNvGraphicFramePr>
@@ -3110,7 +3361,7 @@
                   <pic:spPr bwMode="auto">
                     <a:xfrm>
                       <a:off x="0" y="0"/>
-                      <a:ext cx="5715000" cy="4286250"/>
+                      <a:ext cx="3619500" cy="4410075"/>
                     </a:xfrm>
                     <a:prstGeom prst="rect">
                       <a:avLst/>
@@ -3136,18 +3387,13 @@
           <w:sz w:val="18"/>
           <w:szCs w:val="18"/>
         </w:rPr>
-        <w:t xml:space="preserve">An unknown account produces a friendly message and a retry button, not a broken screen.</w:t>
-      </w:r>
-    </w:p>
-    <w:p>
-      <w:r>
-        <w:br w:type="page"/>
-      </w:r>
-    </w:p>
-    <w:p>
-      <w:pPr>
-        <w:pStyle w:val="Heading1"/>
-        <w:spacing w:after="120" w:before="300"/>
+        <w:t xml:space="preserve">Item name, note, colour-coded priority, and timestamp, each with Edit and Delete.</w:t>
+      </w:r>
+    </w:p>
+    <w:p>
+      <w:pPr>
+        <w:pStyle w:val="Heading2"/>
+        <w:spacing w:after="70" w:before="180"/>
       </w:pPr>
       <w:bookmarkStart w:name="_Toc17" w:id="17"/>
       <w:r>
@@ -3156,9 +3402,92 @@
           <w:bCs/>
           <w:color w:val="16324F"/>
         </w:rPr>
+        <w:t xml:space="preserve">6.6  Graceful error state</w:t>
+      </w:r>
+      <w:bookmarkEnd w:id="17"/>
+    </w:p>
+    <w:p>
+      <w:pPr>
+        <w:spacing w:after="60" w:before="120"/>
+        <w:jc w:val="center"/>
+      </w:pPr>
+      <w:r>
+        <w:drawing>
+          <wp:inline distT="0" distB="0" distL="0" distR="0">
+            <wp:extent cx="3619500" cy="4410075"/>
+            <wp:effectExtent t="0" r="0" b="0" l="0"/>
+            <wp:docPr id="6" name="" descr="" title=""/>
+            <wp:cNvGraphicFramePr>
+              <a:graphicFrameLocks xmlns:a="http://schemas.openxmlformats.org/drawingml/2006/main" noChangeAspect="1"/>
+            </wp:cNvGraphicFramePr>
+            <a:graphic xmlns:a="http://schemas.openxmlformats.org/drawingml/2006/main">
+              <a:graphicData uri="http://schemas.openxmlformats.org/drawingml/2006/picture">
+                <pic:pic xmlns:pic="http://schemas.openxmlformats.org/drawingml/2006/picture">
+                  <pic:nvPicPr>
+                    <pic:cNvPr id="0" name="" descr=""/>
+                    <pic:cNvPicPr>
+                      <a:picLocks noChangeAspect="1" noChangeArrowheads="1"/>
+                    </pic:cNvPicPr>
+                  </pic:nvPicPr>
+                  <pic:blipFill>
+                    <a:blip r:embed="rId12" cstate="none"/>
+                    <a:srcRect/>
+                    <a:stretch>
+                      <a:fillRect/>
+                    </a:stretch>
+                  </pic:blipFill>
+                  <pic:spPr bwMode="auto">
+                    <a:xfrm>
+                      <a:off x="0" y="0"/>
+                      <a:ext cx="3619500" cy="4410075"/>
+                    </a:xfrm>
+                    <a:prstGeom prst="rect">
+                      <a:avLst/>
+                    </a:prstGeom>
+                  </pic:spPr>
+                </pic:pic>
+              </a:graphicData>
+            </a:graphic>
+          </wp:inline>
+        </w:drawing>
+      </w:r>
+    </w:p>
+    <w:p>
+      <w:pPr>
+        <w:spacing w:after="200"/>
+        <w:jc w:val="center"/>
+      </w:pPr>
+      <w:r>
+        <w:rPr>
+          <w:i/>
+          <w:iCs/>
+          <w:color w:val="5B5E68"/>
+          <w:sz w:val="18"/>
+          <w:szCs w:val="18"/>
+        </w:rPr>
+        <w:t xml:space="preserve">An unknown account produces a friendly message and a retry button, not a broken screen.</w:t>
+      </w:r>
+    </w:p>
+    <w:p>
+      <w:r>
+        <w:br w:type="page"/>
+      </w:r>
+    </w:p>
+    <w:p>
+      <w:pPr>
+        <w:pStyle w:val="Heading1"/>
+        <w:spacing w:after="120" w:before="300"/>
+      </w:pPr>
+      <w:bookmarkStart w:name="_Toc18" w:id="18"/>
+      <w:r>
+        <w:rPr>
+          <w:b/>
+          <w:bCs/>
+          <w:color w:val="16324F"/>
+        </w:rPr>
         <w:t xml:space="preserve">7.  Design Decisions</w:t>
       </w:r>
-      <w:bookmarkEnd w:id="17"/>
+      <w:bookmarkEnd w:id="18"/>
     </w:p>
     <w:p>
       <w:pPr>
@@ -3305,7 +3634,7 @@
         <w:pStyle w:val="Heading1"/>
         <w:spacing w:after="120" w:before="300"/>
       </w:pPr>
-      <w:bookmarkStart w:name="_Toc18" w:id="18"/>
+      <w:bookmarkStart w:name="_Toc19" w:id="19"/>
       <w:r>
         <w:rPr>
           <w:b/>
@@ -3314,7 +3643,7 @@
         </w:rPr>
         <w:t xml:space="preserve">8.  Assumptions</w:t>
       </w:r>
-      <w:bookmarkEnd w:id="18"/>
+      <w:bookmarkEnd w:id="19"/>
     </w:p>
     <w:p>
       <w:pPr>
@@ -3393,7 +3722,7 @@
         <w:pStyle w:val="Heading1"/>
         <w:spacing w:after="120" w:before="300"/>
       </w:pPr>
-      <w:bookmarkStart w:name="_Toc19" w:id="19"/>
+      <w:bookmarkStart w:name="_Toc20" w:id="20"/>
       <w:r>
         <w:rPr>
           <w:b/>
@@ -3402,7 +3731,7 @@
         </w:rPr>
         <w:t xml:space="preserve">9.  Known Limitations</w:t>
       </w:r>
-      <w:bookmarkEnd w:id="19"/>
+      <w:bookmarkEnd w:id="20"/>
     </w:p>
     <w:p>
       <w:pPr>
@@ -3521,7 +3850,7 @@
         <w:pStyle w:val="Heading1"/>
         <w:spacing w:after="120" w:before="300"/>
       </w:pPr>
-      <w:bookmarkStart w:name="_Toc20" w:id="20"/>
+      <w:bookmarkStart w:name="_Toc21" w:id="21"/>
       <w:r>
         <w:rPr>
           <w:b/>
@@ -3530,7 +3859,7 @@
         </w:rPr>
         <w:t xml:space="preserve">10.  What I Would Improve Next</w:t>
       </w:r>
-      <w:bookmarkEnd w:id="20"/>
+      <w:bookmarkEnd w:id="21"/>
     </w:p>
     <w:p>
       <w:pPr>

</xml_diff>